<commit_message>
Fix typo: UR -> URL
</commit_message>
<xml_diff>
--- a/docs/Quick_Guide_EN.docx
+++ b/docs/Quick_Guide_EN.docx
@@ -4,7 +4,7 @@
   <w:body>
     <w:p>
       <w:pPr>
-        <w:pStyle w:val="Heading1"/>
+        <w:pStyle w:val="1"/>
       </w:pPr>
       <w:r>
         <w:rPr>
@@ -30,19 +30,11 @@
         </w:rPr>
         <w:t xml:space="preserve">The </w:t>
       </w:r>
-      <w:proofErr w:type="spellStart"/>
-      <w:r>
-        <w:rPr>
-          <w:lang w:val="en"/>
-        </w:rPr>
-        <w:t>ObsoNET</w:t>
-      </w:r>
-      <w:proofErr w:type="spellEnd"/>
-      <w:r>
-        <w:rPr>
-          <w:lang w:val="en"/>
-        </w:rPr>
-        <w:t xml:space="preserve"> is the first network card built for MSX. In 2004, hardware designer Daniel Berdugo and software developer Nestor Soriano</w:t>
+      <w:r>
+        <w:rPr>
+          <w:lang w:val="en"/>
+        </w:rPr>
+        <w:t>ObsoNET is the first network card built for MSX. In 2004, hardware designer Daniel Berdugo and software developer Nestor Soriano</w:t>
       </w:r>
       <w:r>
         <w:rPr>
@@ -124,7 +116,7 @@
     </w:p>
     <w:p>
       <w:pPr>
-        <w:pStyle w:val="Heading2"/>
+        <w:pStyle w:val="2"/>
         <w:rPr>
           <w:lang w:val="en"/>
         </w:rPr>
@@ -153,7 +145,7 @@
     </w:p>
     <w:p>
       <w:pPr>
-        <w:pStyle w:val="ListParagraph"/>
+        <w:pStyle w:val="a4"/>
         <w:numPr>
           <w:ilvl w:val="0"/>
           <w:numId w:val="8"/>
@@ -174,7 +166,7 @@
     </w:p>
     <w:p>
       <w:pPr>
-        <w:pStyle w:val="ListParagraph"/>
+        <w:pStyle w:val="a4"/>
         <w:numPr>
           <w:ilvl w:val="0"/>
           <w:numId w:val="8"/>
@@ -211,20 +203,12 @@
         <w:rPr>
           <w:lang w:val="en"/>
         </w:rPr>
-        <w:t xml:space="preserve"> </w:t>
-      </w:r>
-      <w:proofErr w:type="spellStart"/>
-      <w:r>
-        <w:rPr>
-          <w:lang w:val="en"/>
-        </w:rPr>
-        <w:t>Nextor</w:t>
-      </w:r>
-      <w:proofErr w:type="spellEnd"/>
-    </w:p>
-    <w:p>
-      <w:pPr>
-        <w:pStyle w:val="ListParagraph"/>
+        <w:t xml:space="preserve"> Nextor</w:t>
+      </w:r>
+    </w:p>
+    <w:p>
+      <w:pPr>
+        <w:pStyle w:val="a4"/>
         <w:numPr>
           <w:ilvl w:val="0"/>
           <w:numId w:val="8"/>
@@ -234,26 +218,12 @@
         <w:rPr>
           <w:lang w:val="en"/>
         </w:rPr>
-        <w:t xml:space="preserve">The appropriate variant of INL.COM, the </w:t>
-      </w:r>
-      <w:proofErr w:type="spellStart"/>
-      <w:r>
-        <w:rPr>
-          <w:lang w:val="en"/>
-        </w:rPr>
-        <w:t>InterNestor</w:t>
-      </w:r>
-      <w:proofErr w:type="spellEnd"/>
-      <w:r>
-        <w:rPr>
-          <w:lang w:val="en"/>
-        </w:rPr>
-        <w:t xml:space="preserve"> Lite installation and control program</w:t>
-      </w:r>
-    </w:p>
-    <w:p>
-      <w:pPr>
-        <w:pStyle w:val="ListParagraph"/>
+        <w:t>The appropriate variant of INL.COM, the InterNestor Lite installation and control program</w:t>
+      </w:r>
+    </w:p>
+    <w:p>
+      <w:pPr>
+        <w:pStyle w:val="a4"/>
         <w:numPr>
           <w:ilvl w:val="0"/>
           <w:numId w:val="8"/>
@@ -300,21 +270,7 @@
         <w:rPr>
           <w:lang w:val="en"/>
         </w:rPr>
-        <w:t xml:space="preserve"> or </w:t>
-      </w:r>
-      <w:proofErr w:type="spellStart"/>
-      <w:r>
-        <w:rPr>
-          <w:lang w:val="en"/>
-        </w:rPr>
-        <w:t>Nextor</w:t>
-      </w:r>
-      <w:proofErr w:type="spellEnd"/>
-      <w:r>
-        <w:rPr>
-          <w:lang w:val="en"/>
-        </w:rPr>
-        <w:t>: RAMHELPR.COM (installs a UNAPI RAM helper)</w:t>
+        <w:t xml:space="preserve"> or Nextor: RAMHELPR.COM (installs a UNAPI RAM helper)</w:t>
       </w:r>
     </w:p>
     <w:p>
@@ -334,10 +290,10 @@
       <w:r>
         <w:t xml:space="preserve"> </w:t>
       </w:r>
-      <w:hyperlink r:id="rId5" w:history="1">
+      <w:hyperlink r:id="rId7" w:history="1">
         <w:r>
           <w:rPr>
-            <w:rStyle w:val="Hyperlink"/>
+            <w:rStyle w:val="a3"/>
           </w:rPr>
           <w:t>http://tinyurl.com/e9f845bb</w:t>
         </w:r>
@@ -345,7 +301,7 @@
     </w:p>
     <w:p>
       <w:pPr>
-        <w:pStyle w:val="Heading2"/>
+        <w:pStyle w:val="2"/>
         <w:rPr>
           <w:lang w:val="en"/>
         </w:rPr>
@@ -372,26 +328,12 @@
         <w:rPr>
           <w:lang w:val="en"/>
         </w:rPr>
-        <w:t xml:space="preserve">To use your Obsonet with TCP/IP you need to run a set of scripted commands. These commands can be run from a floppy disk, </w:t>
-      </w:r>
-      <w:proofErr w:type="spellStart"/>
-      <w:r>
-        <w:rPr>
-          <w:lang w:val="en"/>
-        </w:rPr>
-        <w:t>SDMapper</w:t>
-      </w:r>
-      <w:proofErr w:type="spellEnd"/>
-      <w:r>
-        <w:rPr>
-          <w:lang w:val="en"/>
-        </w:rPr>
-        <w:t>, Carnivore2, MSXUSB, or any other device that allows you to execute commands in an MSX-DOS session.</w:t>
-      </w:r>
-    </w:p>
-    <w:p>
-      <w:pPr>
-        <w:pStyle w:val="ListParagraph"/>
+        <w:t>To use your Obsonet with TCP/IP you need to run a set of scripted commands. These commands can be run from a floppy disk, SDMapper, Carnivore2, MSXUSB, or any other device that allows you to execute commands in an MSX-DOS session.</w:t>
+      </w:r>
+    </w:p>
+    <w:p>
+      <w:pPr>
+        <w:pStyle w:val="a4"/>
         <w:numPr>
           <w:ilvl w:val="0"/>
           <w:numId w:val="9"/>
@@ -424,7 +366,7 @@
     </w:p>
     <w:p>
       <w:pPr>
-        <w:pStyle w:val="ListParagraph"/>
+        <w:pStyle w:val="a4"/>
         <w:numPr>
           <w:ilvl w:val="0"/>
           <w:numId w:val="9"/>
@@ -434,21 +376,7 @@
         <w:rPr>
           <w:lang w:val="en"/>
         </w:rPr>
-        <w:t xml:space="preserve">Install </w:t>
-      </w:r>
-      <w:proofErr w:type="spellStart"/>
-      <w:r>
-        <w:rPr>
-          <w:lang w:val="en"/>
-        </w:rPr>
-        <w:t>InterNestor</w:t>
-      </w:r>
-      <w:proofErr w:type="spellEnd"/>
-      <w:r>
-        <w:rPr>
-          <w:lang w:val="en"/>
-        </w:rPr>
-        <w:t xml:space="preserve"> Lite with </w:t>
+        <w:t xml:space="preserve">Install InterNestor Lite with </w:t>
       </w:r>
       <w:r>
         <w:rPr>
@@ -540,22 +468,32 @@
         <w:rPr>
           <w:lang w:val="en"/>
         </w:rPr>
-        <w:t xml:space="preserve"> I INL 2 I</w:t>
-      </w:r>
-      <w:proofErr w:type="gramStart"/>
-      <w:r>
-        <w:rPr>
-          <w:lang w:val="en"/>
-        </w:rPr>
-        <w:t xml:space="preserve">" </w:t>
-      </w:r>
-      <w:r>
-        <w:rPr>
-          <w:lang w:val="en"/>
-        </w:rPr>
-        <w:t xml:space="preserve"> or</w:t>
-      </w:r>
-      <w:proofErr w:type="gramEnd"/>
+        <w:t xml:space="preserve"> I INL 2 I" </w:t>
+      </w:r>
+      <w:r>
+        <w:rPr>
+          <w:lang w:val="en"/>
+        </w:rPr>
+        <w:t xml:space="preserve"> or </w:t>
+      </w:r>
+      <w:r>
+        <w:rPr>
+          <w:lang w:val="en"/>
+        </w:rPr>
+        <w:t>"</w:t>
+      </w:r>
+      <w:r>
+        <w:rPr>
+          <w:lang w:val="en"/>
+        </w:rPr>
+        <w:t>MSR</w:t>
+      </w:r>
+      <w:r>
+        <w:rPr>
+          <w:lang w:val="en"/>
+        </w:rPr>
+        <w:t xml:space="preserve"> I   INL 2 I </w:t>
+      </w:r>
       <w:r>
         <w:rPr>
           <w:lang w:val="en"/>
@@ -566,26 +504,256 @@
         <w:rPr>
           <w:lang w:val="en"/>
         </w:rPr>
-        <w:t>"</w:t>
-      </w:r>
-      <w:r>
-        <w:rPr>
-          <w:lang w:val="en"/>
-        </w:rPr>
-        <w:t>MSR</w:t>
-      </w:r>
-      <w:r>
-        <w:rPr>
-          <w:lang w:val="en"/>
-        </w:rPr>
-        <w:t xml:space="preserve"> I   INL 2 </w:t>
-      </w:r>
-      <w:proofErr w:type="gramStart"/>
-      <w:r>
-        <w:rPr>
-          <w:lang w:val="en"/>
-        </w:rPr>
-        <w:t xml:space="preserve">I </w:t>
+        <w:t>".</w:t>
+      </w:r>
+    </w:p>
+    <w:p>
+      <w:pPr>
+        <w:pStyle w:val="2"/>
+        <w:rPr>
+          <w:lang w:val="en"/>
+        </w:rPr>
+      </w:pPr>
+      <w:r>
+        <w:rPr>
+          <w:lang w:val="en"/>
+        </w:rPr>
+        <w:t>Configuring IP addresses</w:t>
+      </w:r>
+    </w:p>
+    <w:p>
+      <w:pPr>
+        <w:rPr>
+          <w:lang w:val="en"/>
+        </w:rPr>
+      </w:pPr>
+    </w:p>
+    <w:p>
+      <w:pPr>
+        <w:jc w:val="both"/>
+      </w:pPr>
+      <w:r>
+        <w:rPr>
+          <w:lang w:val="en"/>
+        </w:rPr>
+        <w:t xml:space="preserve">If </w:t>
+      </w:r>
+      <w:r>
+        <w:rPr>
+          <w:lang w:val="en"/>
+        </w:rPr>
+        <w:t xml:space="preserve">there is </w:t>
+      </w:r>
+      <w:r>
+        <w:rPr>
+          <w:lang w:val="en"/>
+        </w:rPr>
+        <w:t xml:space="preserve">a DHCP server on your network (which is the most common case when using the </w:t>
+      </w:r>
+      <w:r>
+        <w:rPr>
+          <w:lang w:val="en"/>
+        </w:rPr>
+        <w:t>operators' Internet access router</w:t>
+      </w:r>
+      <w:r>
+        <w:rPr>
+          <w:lang w:val="en"/>
+        </w:rPr>
+        <w:t>), you don't need to configure anything, as</w:t>
+      </w:r>
+      <w:r>
+        <w:rPr>
+          <w:lang w:val="en"/>
+        </w:rPr>
+        <w:t xml:space="preserve"> Internestor (INL) will get all TCP/IP settings</w:t>
+      </w:r>
+      <w:r>
+        <w:rPr>
+          <w:lang w:val="en"/>
+        </w:rPr>
+        <w:t xml:space="preserve"> automatically. </w:t>
+      </w:r>
+    </w:p>
+    <w:p>
+      <w:pPr>
+        <w:jc w:val="both"/>
+      </w:pPr>
+      <w:r>
+        <w:rPr>
+          <w:lang w:val="en"/>
+        </w:rPr>
+        <w:t>If you want to configure manually</w:t>
+      </w:r>
+      <w:r>
+        <w:rPr>
+          <w:lang w:val="en"/>
+        </w:rPr>
+        <w:t>, you must run the following commands:</w:t>
+      </w:r>
+    </w:p>
+    <w:p>
+      <w:r>
+        <w:rPr>
+          <w:lang w:val="en"/>
+        </w:rPr>
+        <w:t>Inl2 ip d 0</w:t>
+      </w:r>
+    </w:p>
+    <w:p>
+      <w:r>
+        <w:rPr>
+          <w:lang w:val="en"/>
+        </w:rPr>
+        <w:t>Inl2 ip l &lt;endereço IP&gt;</w:t>
+      </w:r>
+    </w:p>
+    <w:p>
+      <w:r>
+        <w:rPr>
+          <w:lang w:val="en"/>
+        </w:rPr>
+        <w:lastRenderedPageBreak/>
+        <w:t>Inl2 ip m &lt;subnet&gt;</w:t>
+      </w:r>
+    </w:p>
+    <w:p>
+      <w:r>
+        <w:rPr>
+          <w:lang w:val="en"/>
+        </w:rPr>
+        <w:t>Inl2 ip g &lt;default gateway endereço IP&gt;</w:t>
+      </w:r>
+    </w:p>
+    <w:p>
+      <w:pPr>
+        <w:rPr>
+          <w:lang w:val="pt-BR"/>
+        </w:rPr>
+      </w:pPr>
+      <w:r>
+        <w:rPr>
+          <w:lang w:val="pt-BR"/>
+        </w:rPr>
+        <w:t>Inl2 ip p &lt;primary endereço IP do servidor DNS&gt;</w:t>
+      </w:r>
+    </w:p>
+    <w:p>
+      <w:r>
+        <w:rPr>
+          <w:lang w:val="en"/>
+        </w:rPr>
+        <w:t>Inl</w:t>
+      </w:r>
+      <w:r>
+        <w:rPr>
+          <w:lang w:val="en"/>
+        </w:rPr>
+        <w:t>2</w:t>
+      </w:r>
+      <w:r>
+        <w:rPr>
+          <w:lang w:val="en"/>
+        </w:rPr>
+        <w:t xml:space="preserve"> ip &lt;secondary DNS server ip endereço IP&gt;</w:t>
+      </w:r>
+    </w:p>
+    <w:p>
+      <w:r>
+        <w:rPr>
+          <w:lang w:val="en"/>
+        </w:rPr>
+        <w:t>The</w:t>
+      </w:r>
+      <w:r>
+        <w:rPr>
+          <w:lang w:val="en"/>
+        </w:rPr>
+        <w:t xml:space="preserve"> first command, inl ip d 0, disables the InterNestor DHCP client,</w:t>
+      </w:r>
+      <w:r>
+        <w:rPr>
+          <w:lang w:val="en"/>
+        </w:rPr>
+        <w:t xml:space="preserve"> to allow manual configuration even on a network with the presence of a DH</w:t>
+      </w:r>
+      <w:r>
+        <w:rPr>
+          <w:rFonts w:hint="eastAsia"/>
+          <w:lang w:val="en" w:eastAsia="ja-JP"/>
+        </w:rPr>
+        <w:t>C</w:t>
+      </w:r>
+      <w:r>
+        <w:rPr>
+          <w:lang w:val="en"/>
+        </w:rPr>
+        <w:t>P server</w:t>
+      </w:r>
+      <w:r>
+        <w:rPr>
+          <w:lang w:val="en"/>
+        </w:rPr>
+        <w:t>.</w:t>
+      </w:r>
+    </w:p>
+    <w:p>
+      <w:pPr>
+        <w:jc w:val="both"/>
+      </w:pPr>
+      <w:r>
+        <w:rPr>
+          <w:lang w:val="en"/>
+        </w:rPr>
+        <w:t xml:space="preserve">Alternatively, to run these </w:t>
+      </w:r>
+      <w:r>
+        <w:rPr>
+          <w:lang w:val="en"/>
+        </w:rPr>
+        <w:t>commands sequentially</w:t>
+      </w:r>
+      <w:r>
+        <w:rPr>
+          <w:lang w:val="en"/>
+        </w:rPr>
+        <w:t xml:space="preserve">, you can create a </w:t>
+      </w:r>
+      <w:r>
+        <w:rPr>
+          <w:lang w:val="en"/>
+        </w:rPr>
+        <w:t xml:space="preserve">BAT or text file </w:t>
+      </w:r>
+      <w:r>
+        <w:rPr>
+          <w:lang w:val="en"/>
+        </w:rPr>
+        <w:t>containing them (minus the inl at the beginning of each line) called INL. CFG in the same directory as INL</w:t>
+      </w:r>
+      <w:r>
+        <w:rPr>
+          <w:lang w:val="en"/>
+        </w:rPr>
+        <w:t xml:space="preserve">2.COM. </w:t>
+      </w:r>
+      <w:r>
+        <w:rPr>
+          <w:lang w:val="en"/>
+        </w:rPr>
+        <w:t xml:space="preserve">In this way, InterNestor will read </w:t>
+      </w:r>
+      <w:r>
+        <w:rPr>
+          <w:lang w:val="en"/>
+        </w:rPr>
+        <w:t xml:space="preserve">the </w:t>
+      </w:r>
+      <w:r>
+        <w:rPr>
+          <w:lang w:val="en"/>
+        </w:rPr>
+        <w:t xml:space="preserve">file and apply the settings from the moment of installation. </w:t>
       </w:r>
       <w:r>
         <w:rPr>
@@ -593,40 +761,6 @@
         </w:rPr>
         <w:t xml:space="preserve"> </w:t>
       </w:r>
-      <w:r>
-        <w:rPr>
-          <w:lang w:val="en"/>
-        </w:rPr>
-        <w:t>"</w:t>
-      </w:r>
-      <w:proofErr w:type="gramEnd"/>
-      <w:r>
-        <w:rPr>
-          <w:lang w:val="en"/>
-        </w:rPr>
-        <w:t>.</w:t>
-      </w:r>
-    </w:p>
-    <w:p>
-      <w:pPr>
-        <w:pStyle w:val="Heading2"/>
-        <w:rPr>
-          <w:lang w:val="en"/>
-        </w:rPr>
-      </w:pPr>
-      <w:r>
-        <w:rPr>
-          <w:lang w:val="en"/>
-        </w:rPr>
-        <w:t>Configuring IP addresses</w:t>
-      </w:r>
-    </w:p>
-    <w:p>
-      <w:pPr>
-        <w:rPr>
-          <w:lang w:val="en"/>
-        </w:rPr>
-      </w:pPr>
     </w:p>
     <w:p>
       <w:pPr>
@@ -636,429 +770,12 @@
         <w:rPr>
           <w:lang w:val="en"/>
         </w:rPr>
-        <w:t xml:space="preserve">If </w:t>
-      </w:r>
-      <w:r>
-        <w:rPr>
-          <w:lang w:val="en"/>
-        </w:rPr>
-        <w:t xml:space="preserve">there is </w:t>
-      </w:r>
-      <w:r>
-        <w:rPr>
-          <w:lang w:val="en"/>
-        </w:rPr>
-        <w:t xml:space="preserve">a DHCP server on your network (which is the most common case when using the </w:t>
-      </w:r>
-      <w:r>
-        <w:rPr>
-          <w:lang w:val="en"/>
-        </w:rPr>
-        <w:t>operators' Internet access router</w:t>
-      </w:r>
-      <w:r>
-        <w:rPr>
-          <w:lang w:val="en"/>
-        </w:rPr>
-        <w:t>), you don't need to configure anything, as</w:t>
-      </w:r>
-      <w:r>
-        <w:rPr>
-          <w:lang w:val="en"/>
-        </w:rPr>
-        <w:t xml:space="preserve"> </w:t>
-      </w:r>
-      <w:proofErr w:type="spellStart"/>
-      <w:r>
-        <w:rPr>
-          <w:lang w:val="en"/>
-        </w:rPr>
-        <w:t>Internestor</w:t>
-      </w:r>
-      <w:proofErr w:type="spellEnd"/>
-      <w:r>
-        <w:rPr>
-          <w:lang w:val="en"/>
-        </w:rPr>
-        <w:t xml:space="preserve"> (INL) will get all TCP/IP settings</w:t>
-      </w:r>
-      <w:r>
-        <w:rPr>
-          <w:lang w:val="en"/>
-        </w:rPr>
-        <w:t xml:space="preserve"> automatically. </w:t>
-      </w:r>
-    </w:p>
-    <w:p>
-      <w:pPr>
-        <w:jc w:val="both"/>
-      </w:pPr>
-      <w:r>
-        <w:rPr>
-          <w:lang w:val="en"/>
-        </w:rPr>
-        <w:t>If you want to configure manually</w:t>
-      </w:r>
-      <w:r>
-        <w:rPr>
-          <w:lang w:val="en"/>
-        </w:rPr>
-        <w:t>, you must run the following commands:</w:t>
-      </w:r>
-    </w:p>
-    <w:p>
-      <w:r>
-        <w:rPr>
-          <w:lang w:val="en"/>
-        </w:rPr>
-        <w:t xml:space="preserve">Inl2 </w:t>
-      </w:r>
-      <w:proofErr w:type="spellStart"/>
-      <w:r>
-        <w:rPr>
-          <w:lang w:val="en"/>
-        </w:rPr>
-        <w:t>ip</w:t>
-      </w:r>
-      <w:proofErr w:type="spellEnd"/>
-      <w:r>
-        <w:rPr>
-          <w:lang w:val="en"/>
-        </w:rPr>
-        <w:t xml:space="preserve"> d 0</w:t>
-      </w:r>
-    </w:p>
-    <w:p>
-      <w:r>
-        <w:rPr>
-          <w:lang w:val="en"/>
-        </w:rPr>
-        <w:t xml:space="preserve">Inl2 </w:t>
-      </w:r>
-      <w:proofErr w:type="spellStart"/>
-      <w:r>
-        <w:rPr>
-          <w:lang w:val="en"/>
-        </w:rPr>
-        <w:t>ip</w:t>
-      </w:r>
-      <w:proofErr w:type="spellEnd"/>
-      <w:r>
-        <w:rPr>
-          <w:lang w:val="en"/>
-        </w:rPr>
-        <w:t xml:space="preserve"> l &lt;endereço IP&gt;</w:t>
-      </w:r>
-    </w:p>
-    <w:p>
-      <w:r>
-        <w:rPr>
-          <w:lang w:val="en"/>
-        </w:rPr>
-        <w:lastRenderedPageBreak/>
-        <w:t xml:space="preserve">Inl2 </w:t>
-      </w:r>
-      <w:proofErr w:type="spellStart"/>
-      <w:r>
-        <w:rPr>
-          <w:lang w:val="en"/>
-        </w:rPr>
-        <w:t>ip</w:t>
-      </w:r>
-      <w:proofErr w:type="spellEnd"/>
-      <w:r>
-        <w:rPr>
-          <w:lang w:val="en"/>
-        </w:rPr>
-        <w:t xml:space="preserve"> m &lt;subnet&gt;</w:t>
-      </w:r>
-    </w:p>
-    <w:p>
-      <w:r>
-        <w:rPr>
-          <w:lang w:val="en"/>
-        </w:rPr>
-        <w:t xml:space="preserve">Inl2 </w:t>
-      </w:r>
-      <w:proofErr w:type="spellStart"/>
-      <w:r>
-        <w:rPr>
-          <w:lang w:val="en"/>
-        </w:rPr>
-        <w:t>ip</w:t>
-      </w:r>
-      <w:proofErr w:type="spellEnd"/>
-      <w:r>
-        <w:rPr>
-          <w:lang w:val="en"/>
-        </w:rPr>
-        <w:t xml:space="preserve"> g &lt;default gateway endereço IP&gt;</w:t>
-      </w:r>
-    </w:p>
-    <w:p>
-      <w:pPr>
-        <w:rPr>
-          <w:lang w:val="pt-BR"/>
-        </w:rPr>
-      </w:pPr>
-      <w:r>
-        <w:rPr>
-          <w:lang w:val="pt-BR"/>
-        </w:rPr>
-        <w:t xml:space="preserve">Inl2 </w:t>
-      </w:r>
-      <w:proofErr w:type="spellStart"/>
-      <w:r>
-        <w:rPr>
-          <w:lang w:val="pt-BR"/>
-        </w:rPr>
-        <w:t>ip</w:t>
-      </w:r>
-      <w:proofErr w:type="spellEnd"/>
-      <w:r>
-        <w:rPr>
-          <w:lang w:val="pt-BR"/>
-        </w:rPr>
-        <w:t xml:space="preserve"> p &lt;</w:t>
-      </w:r>
-      <w:proofErr w:type="spellStart"/>
-      <w:r>
-        <w:rPr>
-          <w:lang w:val="pt-BR"/>
-        </w:rPr>
-        <w:t>primary</w:t>
-      </w:r>
-      <w:proofErr w:type="spellEnd"/>
-      <w:r>
-        <w:rPr>
-          <w:lang w:val="pt-BR"/>
-        </w:rPr>
-        <w:t xml:space="preserve"> endereço IP do servidor DNS&gt;</w:t>
-      </w:r>
-    </w:p>
-    <w:p>
-      <w:r>
-        <w:rPr>
-          <w:lang w:val="en"/>
-        </w:rPr>
-        <w:t>Inl</w:t>
-      </w:r>
-      <w:r>
-        <w:rPr>
-          <w:lang w:val="en"/>
-        </w:rPr>
-        <w:t>2</w:t>
-      </w:r>
-      <w:r>
-        <w:rPr>
-          <w:lang w:val="en"/>
-        </w:rPr>
-        <w:t xml:space="preserve"> </w:t>
-      </w:r>
-      <w:proofErr w:type="spellStart"/>
-      <w:r>
-        <w:rPr>
-          <w:lang w:val="en"/>
-        </w:rPr>
-        <w:t>ip</w:t>
-      </w:r>
-      <w:proofErr w:type="spellEnd"/>
-      <w:r>
-        <w:rPr>
-          <w:lang w:val="en"/>
-        </w:rPr>
-        <w:t xml:space="preserve"> &lt;secondary DNS server </w:t>
-      </w:r>
-      <w:proofErr w:type="spellStart"/>
-      <w:r>
-        <w:rPr>
-          <w:lang w:val="en"/>
-        </w:rPr>
-        <w:t>ip</w:t>
-      </w:r>
-      <w:proofErr w:type="spellEnd"/>
-      <w:r>
-        <w:rPr>
-          <w:lang w:val="en"/>
-        </w:rPr>
-        <w:t xml:space="preserve"> endereço IP&gt;</w:t>
-      </w:r>
-    </w:p>
-    <w:p>
-      <w:r>
-        <w:rPr>
-          <w:lang w:val="en"/>
-        </w:rPr>
-        <w:t>The</w:t>
-      </w:r>
-      <w:r>
-        <w:rPr>
-          <w:lang w:val="en"/>
-        </w:rPr>
-        <w:t xml:space="preserve"> first command, </w:t>
-      </w:r>
-      <w:proofErr w:type="spellStart"/>
-      <w:r>
-        <w:rPr>
-          <w:lang w:val="en"/>
-        </w:rPr>
-        <w:t>inl</w:t>
-      </w:r>
-      <w:proofErr w:type="spellEnd"/>
-      <w:r>
-        <w:rPr>
-          <w:lang w:val="en"/>
-        </w:rPr>
-        <w:t xml:space="preserve"> </w:t>
-      </w:r>
-      <w:proofErr w:type="spellStart"/>
-      <w:r>
-        <w:rPr>
-          <w:lang w:val="en"/>
-        </w:rPr>
-        <w:t>ip</w:t>
-      </w:r>
-      <w:proofErr w:type="spellEnd"/>
-      <w:r>
-        <w:rPr>
-          <w:lang w:val="en"/>
-        </w:rPr>
-        <w:t xml:space="preserve"> d 0, disables the </w:t>
-      </w:r>
-      <w:proofErr w:type="spellStart"/>
-      <w:r>
-        <w:rPr>
-          <w:lang w:val="en"/>
-        </w:rPr>
-        <w:t>InterNestor</w:t>
-      </w:r>
-      <w:proofErr w:type="spellEnd"/>
-      <w:r>
-        <w:rPr>
-          <w:lang w:val="en"/>
-        </w:rPr>
-        <w:t xml:space="preserve"> DHCP client,</w:t>
-      </w:r>
-      <w:r>
-        <w:rPr>
-          <w:lang w:val="en"/>
-        </w:rPr>
-        <w:t xml:space="preserve"> to allow manual configuration even on a network with the presence of a DHP server</w:t>
-      </w:r>
-      <w:r>
-        <w:rPr>
-          <w:lang w:val="en"/>
-        </w:rPr>
-        <w:t>.</w:t>
-      </w:r>
-    </w:p>
-    <w:p>
-      <w:pPr>
-        <w:jc w:val="both"/>
-      </w:pPr>
-      <w:r>
-        <w:rPr>
-          <w:lang w:val="en"/>
-        </w:rPr>
-        <w:t xml:space="preserve">Alternatively, to run these </w:t>
-      </w:r>
-      <w:r>
-        <w:rPr>
-          <w:lang w:val="en"/>
-        </w:rPr>
-        <w:t>commands sequentially</w:t>
-      </w:r>
-      <w:r>
-        <w:rPr>
-          <w:lang w:val="en"/>
-        </w:rPr>
-        <w:t xml:space="preserve">, you can create a </w:t>
-      </w:r>
-      <w:r>
-        <w:rPr>
-          <w:lang w:val="en"/>
-        </w:rPr>
-        <w:t xml:space="preserve">BAT or text file </w:t>
-      </w:r>
-      <w:r>
-        <w:rPr>
-          <w:lang w:val="en"/>
-        </w:rPr>
-        <w:t xml:space="preserve">containing them (minus the </w:t>
-      </w:r>
-      <w:proofErr w:type="spellStart"/>
-      <w:r>
-        <w:rPr>
-          <w:lang w:val="en"/>
-        </w:rPr>
-        <w:t>inl</w:t>
-      </w:r>
-      <w:proofErr w:type="spellEnd"/>
-      <w:r>
-        <w:rPr>
-          <w:lang w:val="en"/>
-        </w:rPr>
-        <w:t xml:space="preserve"> at the beginning of each line) called INL. CFG in the same directory as INL</w:t>
-      </w:r>
-      <w:r>
-        <w:rPr>
-          <w:lang w:val="en"/>
-        </w:rPr>
-        <w:t xml:space="preserve">2.COM. </w:t>
-      </w:r>
-      <w:r>
-        <w:rPr>
-          <w:lang w:val="en"/>
-        </w:rPr>
-        <w:t xml:space="preserve">In this way, </w:t>
-      </w:r>
-      <w:proofErr w:type="spellStart"/>
-      <w:r>
-        <w:rPr>
-          <w:lang w:val="en"/>
-        </w:rPr>
-        <w:t>InterNestor</w:t>
-      </w:r>
-      <w:proofErr w:type="spellEnd"/>
-      <w:r>
-        <w:rPr>
-          <w:lang w:val="en"/>
-        </w:rPr>
-        <w:t xml:space="preserve"> will read </w:t>
-      </w:r>
-      <w:r>
-        <w:rPr>
-          <w:lang w:val="en"/>
-        </w:rPr>
-        <w:t xml:space="preserve">the </w:t>
-      </w:r>
-      <w:r>
-        <w:rPr>
-          <w:lang w:val="en"/>
-        </w:rPr>
-        <w:t xml:space="preserve">file and apply the settings from the moment of installation. </w:t>
-      </w:r>
-      <w:r>
-        <w:rPr>
-          <w:lang w:val="en"/>
-        </w:rPr>
-        <w:t xml:space="preserve"> </w:t>
-      </w:r>
-    </w:p>
-    <w:p>
-      <w:pPr>
-        <w:jc w:val="both"/>
-      </w:pPr>
-      <w:r>
-        <w:rPr>
-          <w:lang w:val="en"/>
-        </w:rPr>
         <w:t>Watch the video available at</w:t>
       </w:r>
-      <w:hyperlink r:id="rId6" w:history="1">
+      <w:hyperlink r:id="rId8" w:history="1">
         <w:r>
           <w:rPr>
-            <w:rStyle w:val="Hyperlink"/>
+            <w:rStyle w:val="a3"/>
             <w:lang w:val="en"/>
           </w:rPr>
           <w:t>https://www.youtube.com/watch?v=Ph_3VFheo2I</w:t>
@@ -1084,14 +801,13 @@
     </w:p>
     <w:p>
       <w:pPr>
-        <w:pStyle w:val="ListParagraph"/>
+        <w:pStyle w:val="a4"/>
         <w:numPr>
           <w:ilvl w:val="0"/>
           <w:numId w:val="4"/>
         </w:numPr>
         <w:jc w:val="both"/>
       </w:pPr>
-      <w:proofErr w:type="spellStart"/>
       <w:r>
         <w:t>Inter</w:t>
       </w:r>
@@ -1099,11 +815,7 @@
         <w:t>N</w:t>
       </w:r>
       <w:r>
-        <w:t>estor</w:t>
-      </w:r>
-      <w:proofErr w:type="spellEnd"/>
-      <w:r>
-        <w:t xml:space="preserve"> Lite – Architecture and Limitations</w:t>
+        <w:t>estor Lite – Architecture and Limitations</w:t>
       </w:r>
       <w:r>
         <w:t xml:space="preserve"> </w:t>
@@ -1111,10 +823,10 @@
       <w:r>
         <w:t xml:space="preserve">- </w:t>
       </w:r>
-      <w:hyperlink r:id="rId7" w:anchor="internestor-lite---architecture-and-limitations" w:history="1">
+      <w:hyperlink r:id="rId9" w:anchor="internestor-lite---architecture-and-limitations" w:history="1">
         <w:r>
           <w:rPr>
-            <w:rStyle w:val="Hyperlink"/>
+            <w:rStyle w:val="a3"/>
           </w:rPr>
           <w:t>https://github.com/Konamiman/MSX/blob/master/SRC/INL/DOCS/architecture.md#internestor-lite---architecture-and-limitations</w:t>
         </w:r>
@@ -1122,25 +834,20 @@
     </w:p>
     <w:p>
       <w:pPr>
-        <w:pStyle w:val="ListParagraph"/>
+        <w:pStyle w:val="a4"/>
         <w:numPr>
           <w:ilvl w:val="0"/>
           <w:numId w:val="4"/>
         </w:numPr>
         <w:jc w:val="both"/>
       </w:pPr>
-      <w:proofErr w:type="spellStart"/>
-      <w:r>
-        <w:t>InterNestor</w:t>
-      </w:r>
-      <w:proofErr w:type="spellEnd"/>
-      <w:r>
-        <w:t xml:space="preserve"> Lite – Configuration - </w:t>
-      </w:r>
-      <w:hyperlink r:id="rId8" w:history="1">
+      <w:r>
+        <w:t xml:space="preserve">InterNestor Lite – Configuration - </w:t>
+      </w:r>
+      <w:hyperlink r:id="rId10" w:history="1">
         <w:r>
           <w:rPr>
-            <w:rStyle w:val="Hyperlink"/>
+            <w:rStyle w:val="a3"/>
           </w:rPr>
           <w:t>https://github.com/Konamiman/MSX/blob/master/SRC/INL/DOCS/configuration.md</w:t>
         </w:r>
@@ -1148,7 +855,7 @@
     </w:p>
     <w:p>
       <w:pPr>
-        <w:pStyle w:val="ListParagraph"/>
+        <w:pStyle w:val="a4"/>
         <w:numPr>
           <w:ilvl w:val="0"/>
           <w:numId w:val="4"/>
@@ -1158,24 +865,16 @@
           <w:lang w:val="pt-BR"/>
         </w:rPr>
       </w:pPr>
-      <w:proofErr w:type="spellStart"/>
       <w:r>
         <w:rPr>
           <w:lang w:val="pt-BR"/>
         </w:rPr>
-        <w:t>InterNestor</w:t>
-      </w:r>
-      <w:proofErr w:type="spellEnd"/>
-      <w:r>
-        <w:rPr>
-          <w:lang w:val="pt-BR"/>
-        </w:rPr>
-        <w:t xml:space="preserve"> Lite – Referência dos Comandos - </w:t>
-      </w:r>
-      <w:hyperlink r:id="rId9" w:history="1">
+        <w:t xml:space="preserve">InterNestor Lite – Referência dos Comandos - </w:t>
+      </w:r>
+      <w:hyperlink r:id="rId11" w:history="1">
         <w:r>
           <w:rPr>
-            <w:rStyle w:val="Hyperlink"/>
+            <w:rStyle w:val="a3"/>
             <w:lang w:val="pt-BR"/>
           </w:rPr>
           <w:t>https://github.com/Konamiman/MSX/blob/master/SRC/INL/DOCS/control-program.md</w:t>
@@ -1184,7 +883,7 @@
     </w:p>
     <w:p>
       <w:pPr>
-        <w:pStyle w:val="ListParagraph"/>
+        <w:pStyle w:val="a4"/>
         <w:numPr>
           <w:ilvl w:val="0"/>
           <w:numId w:val="4"/>
@@ -1194,10 +893,10 @@
       <w:r>
         <w:t xml:space="preserve">MSXHUB – Install software directly from Internet using an UNAPI compatible network card - </w:t>
       </w:r>
-      <w:hyperlink r:id="rId10" w:history="1">
+      <w:hyperlink r:id="rId12" w:history="1">
         <w:r>
           <w:rPr>
-            <w:rStyle w:val="Hyperlink"/>
+            <w:rStyle w:val="a3"/>
           </w:rPr>
           <w:t>https://msxhub.com/</w:t>
         </w:r>
@@ -1218,6 +917,56 @@
     </w:sectPr>
   </w:body>
 </w:document>
+</file>
+
+<file path=word/endnotes.xml><?xml version="1.0" encoding="utf-8"?>
+<w:endnotes xmlns:wpc="http://schemas.microsoft.com/office/word/2010/wordprocessingCanvas" xmlns:cx="http://schemas.microsoft.com/office/drawing/2014/chartex" xmlns:cx1="http://schemas.microsoft.com/office/drawing/2015/9/8/chartex" xmlns:cx2="http://schemas.microsoft.com/office/drawing/2015/10/21/chartex" xmlns:cx3="http://schemas.microsoft.com/office/drawing/2016/5/9/chartex" xmlns:cx4="http://schemas.microsoft.com/office/drawing/2016/5/10/chartex" xmlns:cx5="http://schemas.microsoft.com/office/drawing/2016/5/11/chartex" xmlns:cx6="http://schemas.microsoft.com/office/drawing/2016/5/12/chartex" xmlns:cx7="http://schemas.microsoft.com/office/drawing/2016/5/13/chartex" xmlns:cx8="http://schemas.microsoft.com/office/drawing/2016/5/14/chartex" xmlns:mc="http://schemas.openxmlformats.org/markup-compatibility/2006" xmlns:aink="http://schemas.microsoft.com/office/drawing/2016/ink" xmlns:am3d="http://schemas.microsoft.com/office/drawing/2017/model3d" xmlns:o="urn:schemas-microsoft-com:office:office" xmlns:oel="http://schemas.microsoft.com/office/2019/extlst" xmlns:r="http://schemas.openxmlformats.org/officeDocument/2006/relationships" xmlns:m="http://schemas.openxmlformats.org/officeDocument/2006/math" xmlns:v="urn:schemas-microsoft-com:vml" xmlns:wp14="http://schemas.microsoft.com/office/word/2010/wordprocessingDrawing" xmlns:wp="http://schemas.openxmlformats.org/drawingml/2006/wordprocessingDrawing" xmlns:w10="urn:schemas-microsoft-com:office:word" xmlns:w="http://schemas.openxmlformats.org/wordprocessingml/2006/main" xmlns:w14="http://schemas.microsoft.com/office/word/2010/wordml" xmlns:w15="http://schemas.microsoft.com/office/word/2012/wordml" xmlns:w16cex="http://schemas.microsoft.com/office/word/2018/wordml/cex" xmlns:w16cid="http://schemas.microsoft.com/office/word/2016/wordml/cid" xmlns:w16="http://schemas.microsoft.com/office/word/2018/wordml" xmlns:w16du="http://schemas.microsoft.com/office/word/2023/wordml/word16du" xmlns:w16sdtdh="http://schemas.microsoft.com/office/word/2020/wordml/sdtdatahash" xmlns:w16sdtfl="http://schemas.microsoft.com/office/word/2024/wordml/sdtformatlock" xmlns:w16se="http://schemas.microsoft.com/office/word/2015/wordml/symex" xmlns:wpg="http://schemas.microsoft.com/office/word/2010/wordprocessingGroup" xmlns:wpi="http://schemas.microsoft.com/office/word/2010/wordprocessingInk" xmlns:wne="http://schemas.microsoft.com/office/word/2006/wordml" xmlns:wps="http://schemas.microsoft.com/office/word/2010/wordprocessingShape" mc:Ignorable="w14 w15 w16se w16cid w16 w16cex w16sdtdh w16sdtfl w16du wp14">
+  <w:endnote w:type="separator" w:id="-1">
+    <w:p>
+      <w:pPr>
+        <w:spacing w:after="0" w:line="240" w:lineRule="auto"/>
+      </w:pPr>
+      <w:r>
+        <w:separator/>
+      </w:r>
+    </w:p>
+  </w:endnote>
+  <w:endnote w:type="continuationSeparator" w:id="0">
+    <w:p>
+      <w:pPr>
+        <w:spacing w:after="0" w:line="240" w:lineRule="auto"/>
+      </w:pPr>
+      <w:r>
+        <w:continuationSeparator/>
+      </w:r>
+    </w:p>
+  </w:endnote>
+</w:endnotes>
+</file>
+
+<file path=word/footnotes.xml><?xml version="1.0" encoding="utf-8"?>
+<w:footnotes xmlns:wpc="http://schemas.microsoft.com/office/word/2010/wordprocessingCanvas" xmlns:cx="http://schemas.microsoft.com/office/drawing/2014/chartex" xmlns:cx1="http://schemas.microsoft.com/office/drawing/2015/9/8/chartex" xmlns:cx2="http://schemas.microsoft.com/office/drawing/2015/10/21/chartex" xmlns:cx3="http://schemas.microsoft.com/office/drawing/2016/5/9/chartex" xmlns:cx4="http://schemas.microsoft.com/office/drawing/2016/5/10/chartex" xmlns:cx5="http://schemas.microsoft.com/office/drawing/2016/5/11/chartex" xmlns:cx6="http://schemas.microsoft.com/office/drawing/2016/5/12/chartex" xmlns:cx7="http://schemas.microsoft.com/office/drawing/2016/5/13/chartex" xmlns:cx8="http://schemas.microsoft.com/office/drawing/2016/5/14/chartex" xmlns:mc="http://schemas.openxmlformats.org/markup-compatibility/2006" xmlns:aink="http://schemas.microsoft.com/office/drawing/2016/ink" xmlns:am3d="http://schemas.microsoft.com/office/drawing/2017/model3d" xmlns:o="urn:schemas-microsoft-com:office:office" xmlns:oel="http://schemas.microsoft.com/office/2019/extlst" xmlns:r="http://schemas.openxmlformats.org/officeDocument/2006/relationships" xmlns:m="http://schemas.openxmlformats.org/officeDocument/2006/math" xmlns:v="urn:schemas-microsoft-com:vml" xmlns:wp14="http://schemas.microsoft.com/office/word/2010/wordprocessingDrawing" xmlns:wp="http://schemas.openxmlformats.org/drawingml/2006/wordprocessingDrawing" xmlns:w10="urn:schemas-microsoft-com:office:word" xmlns:w="http://schemas.openxmlformats.org/wordprocessingml/2006/main" xmlns:w14="http://schemas.microsoft.com/office/word/2010/wordml" xmlns:w15="http://schemas.microsoft.com/office/word/2012/wordml" xmlns:w16cex="http://schemas.microsoft.com/office/word/2018/wordml/cex" xmlns:w16cid="http://schemas.microsoft.com/office/word/2016/wordml/cid" xmlns:w16="http://schemas.microsoft.com/office/word/2018/wordml" xmlns:w16du="http://schemas.microsoft.com/office/word/2023/wordml/word16du" xmlns:w16sdtdh="http://schemas.microsoft.com/office/word/2020/wordml/sdtdatahash" xmlns:w16sdtfl="http://schemas.microsoft.com/office/word/2024/wordml/sdtformatlock" xmlns:w16se="http://schemas.microsoft.com/office/word/2015/wordml/symex" xmlns:wpg="http://schemas.microsoft.com/office/word/2010/wordprocessingGroup" xmlns:wpi="http://schemas.microsoft.com/office/word/2010/wordprocessingInk" xmlns:wne="http://schemas.microsoft.com/office/word/2006/wordml" xmlns:wps="http://schemas.microsoft.com/office/word/2010/wordprocessingShape" mc:Ignorable="w14 w15 w16se w16cid w16 w16cex w16sdtdh w16sdtfl w16du wp14">
+  <w:footnote w:type="separator" w:id="-1">
+    <w:p>
+      <w:pPr>
+        <w:spacing w:after="0" w:line="240" w:lineRule="auto"/>
+      </w:pPr>
+      <w:r>
+        <w:separator/>
+      </w:r>
+    </w:p>
+  </w:footnote>
+  <w:footnote w:type="continuationSeparator" w:id="0">
+    <w:p>
+      <w:pPr>
+        <w:spacing w:after="0" w:line="240" w:lineRule="auto"/>
+      </w:pPr>
+      <w:r>
+        <w:continuationSeparator/>
+      </w:r>
+    </w:p>
+  </w:footnote>
+</w:footnotes>
 </file>
 
 <file path=word/numbering.xml><?xml version="1.0" encoding="utf-8"?>
@@ -2429,7 +2178,7 @@
   <w:docDefaults>
     <w:rPrDefault>
       <w:rPr>
-        <w:rFonts w:asciiTheme="minorHAnsi" w:eastAsiaTheme="minorHAnsi" w:hAnsiTheme="minorHAnsi" w:cstheme="minorBidi"/>
+        <w:rFonts w:asciiTheme="minorHAnsi" w:eastAsiaTheme="minorEastAsia" w:hAnsiTheme="minorHAnsi" w:cstheme="minorBidi"/>
         <w:sz w:val="22"/>
         <w:szCs w:val="22"/>
         <w:lang w:val="en-US" w:eastAsia="en-US" w:bidi="ar-SA"/>
@@ -2819,15 +2568,15 @@
     <w:lsdException w:name="Unresolved Mention" w:semiHidden="1" w:unhideWhenUsed="1"/>
     <w:lsdException w:name="Smart Link" w:semiHidden="1" w:unhideWhenUsed="1"/>
   </w:latentStyles>
-  <w:style w:type="paragraph" w:default="1" w:styleId="Normal">
+  <w:style w:type="paragraph" w:default="1" w:styleId="a">
     <w:name w:val="Normal"/>
     <w:qFormat/>
   </w:style>
-  <w:style w:type="paragraph" w:styleId="Heading1">
+  <w:style w:type="paragraph" w:styleId="1">
     <w:name w:val="heading 1"/>
-    <w:basedOn w:val="Normal"/>
-    <w:next w:val="Normal"/>
-    <w:link w:val="Heading1Char"/>
+    <w:basedOn w:val="a"/>
+    <w:next w:val="a"/>
+    <w:link w:val="10"/>
     <w:uiPriority w:val="9"/>
     <w:qFormat/>
     <w:rsid w:val="005753F1"/>
@@ -2844,11 +2593,11 @@
       <w:szCs w:val="32"/>
     </w:rPr>
   </w:style>
-  <w:style w:type="paragraph" w:styleId="Heading2">
+  <w:style w:type="paragraph" w:styleId="2">
     <w:name w:val="heading 2"/>
-    <w:basedOn w:val="Normal"/>
-    <w:next w:val="Normal"/>
-    <w:link w:val="Heading2Char"/>
+    <w:basedOn w:val="a"/>
+    <w:next w:val="a"/>
+    <w:link w:val="20"/>
     <w:uiPriority w:val="9"/>
     <w:unhideWhenUsed/>
     <w:qFormat/>
@@ -2866,13 +2615,13 @@
       <w:szCs w:val="26"/>
     </w:rPr>
   </w:style>
-  <w:style w:type="character" w:default="1" w:styleId="DefaultParagraphFont">
+  <w:style w:type="character" w:default="1" w:styleId="a0">
     <w:name w:val="Default Paragraph Font"/>
     <w:uiPriority w:val="1"/>
     <w:semiHidden/>
     <w:unhideWhenUsed/>
   </w:style>
-  <w:style w:type="table" w:default="1" w:styleId="TableNormal">
+  <w:style w:type="table" w:default="1" w:styleId="a1">
     <w:name w:val="Normal Table"/>
     <w:uiPriority w:val="99"/>
     <w:semiHidden/>
@@ -2887,16 +2636,16 @@
       </w:tblCellMar>
     </w:tblPr>
   </w:style>
-  <w:style w:type="numbering" w:default="1" w:styleId="NoList">
+  <w:style w:type="numbering" w:default="1" w:styleId="a2">
     <w:name w:val="No List"/>
     <w:uiPriority w:val="99"/>
     <w:semiHidden/>
     <w:unhideWhenUsed/>
   </w:style>
-  <w:style w:type="character" w:customStyle="1" w:styleId="Heading1Char">
-    <w:name w:val="Heading 1 Char"/>
-    <w:basedOn w:val="DefaultParagraphFont"/>
-    <w:link w:val="Heading1"/>
+  <w:style w:type="character" w:customStyle="1" w:styleId="10">
+    <w:name w:val="見出し 1 (文字)"/>
+    <w:basedOn w:val="a0"/>
+    <w:link w:val="1"/>
     <w:uiPriority w:val="9"/>
     <w:rsid w:val="005753F1"/>
     <w:rPr>
@@ -2906,10 +2655,10 @@
       <w:szCs w:val="32"/>
     </w:rPr>
   </w:style>
-  <w:style w:type="character" w:customStyle="1" w:styleId="Heading2Char">
-    <w:name w:val="Heading 2 Char"/>
-    <w:basedOn w:val="DefaultParagraphFont"/>
-    <w:link w:val="Heading2"/>
+  <w:style w:type="character" w:customStyle="1" w:styleId="20">
+    <w:name w:val="見出し 2 (文字)"/>
+    <w:basedOn w:val="a0"/>
+    <w:link w:val="2"/>
     <w:uiPriority w:val="9"/>
     <w:rsid w:val="005753F1"/>
     <w:rPr>
@@ -2919,9 +2668,9 @@
       <w:szCs w:val="26"/>
     </w:rPr>
   </w:style>
-  <w:style w:type="character" w:styleId="Hyperlink">
+  <w:style w:type="character" w:styleId="a3">
     <w:name w:val="Hyperlink"/>
-    <w:basedOn w:val="DefaultParagraphFont"/>
+    <w:basedOn w:val="a0"/>
     <w:uiPriority w:val="99"/>
     <w:unhideWhenUsed/>
     <w:rsid w:val="005753F1"/>
@@ -2930,9 +2679,9 @@
       <w:u w:val="single"/>
     </w:rPr>
   </w:style>
-  <w:style w:type="paragraph" w:styleId="ListParagraph">
+  <w:style w:type="paragraph" w:styleId="a4">
     <w:name w:val="List Paragraph"/>
-    <w:basedOn w:val="Normal"/>
+    <w:basedOn w:val="a"/>
     <w:uiPriority w:val="34"/>
     <w:qFormat/>
     <w:rsid w:val="005753F1"/>
@@ -2941,9 +2690,9 @@
       <w:contextualSpacing/>
     </w:pPr>
   </w:style>
-  <w:style w:type="character" w:styleId="UnresolvedMention">
+  <w:style w:type="character" w:styleId="a5">
     <w:name w:val="Unresolved Mention"/>
-    <w:basedOn w:val="DefaultParagraphFont"/>
+    <w:basedOn w:val="a0"/>
     <w:uiPriority w:val="99"/>
     <w:semiHidden/>
     <w:unhideWhenUsed/>
@@ -2953,9 +2702,9 @@
       <w:shd w:val="clear" w:color="auto" w:fill="E1DFDD"/>
     </w:rPr>
   </w:style>
-  <w:style w:type="character" w:styleId="FollowedHyperlink">
+  <w:style w:type="character" w:styleId="a6">
     <w:name w:val="FollowedHyperlink"/>
-    <w:basedOn w:val="DefaultParagraphFont"/>
+    <w:basedOn w:val="a0"/>
     <w:uiPriority w:val="99"/>
     <w:semiHidden/>
     <w:unhideWhenUsed/>
@@ -2964,6 +2713,50 @@
       <w:color w:val="954F72" w:themeColor="followedHyperlink"/>
       <w:u w:val="single"/>
     </w:rPr>
+  </w:style>
+  <w:style w:type="paragraph" w:styleId="a7">
+    <w:name w:val="header"/>
+    <w:basedOn w:val="a"/>
+    <w:link w:val="a8"/>
+    <w:uiPriority w:val="99"/>
+    <w:unhideWhenUsed/>
+    <w:rsid w:val="00083C66"/>
+    <w:pPr>
+      <w:tabs>
+        <w:tab w:val="center" w:pos="4252"/>
+        <w:tab w:val="right" w:pos="8504"/>
+      </w:tabs>
+      <w:snapToGrid w:val="0"/>
+    </w:pPr>
+  </w:style>
+  <w:style w:type="character" w:customStyle="1" w:styleId="a8">
+    <w:name w:val="ヘッダー (文字)"/>
+    <w:basedOn w:val="a0"/>
+    <w:link w:val="a7"/>
+    <w:uiPriority w:val="99"/>
+    <w:rsid w:val="00083C66"/>
+  </w:style>
+  <w:style w:type="paragraph" w:styleId="a9">
+    <w:name w:val="footer"/>
+    <w:basedOn w:val="a"/>
+    <w:link w:val="aa"/>
+    <w:uiPriority w:val="99"/>
+    <w:unhideWhenUsed/>
+    <w:rsid w:val="00083C66"/>
+    <w:pPr>
+      <w:tabs>
+        <w:tab w:val="center" w:pos="4252"/>
+        <w:tab w:val="right" w:pos="8504"/>
+      </w:tabs>
+      <w:snapToGrid w:val="0"/>
+    </w:pPr>
+  </w:style>
+  <w:style w:type="character" w:customStyle="1" w:styleId="aa">
+    <w:name w:val="フッター (文字)"/>
+    <w:basedOn w:val="a0"/>
+    <w:link w:val="a9"/>
+    <w:uiPriority w:val="99"/>
+    <w:rsid w:val="00083C66"/>
   </w:style>
 </w:styles>
 </file>

</xml_diff>

<commit_message>
"INL 2" -> "INL2"
</commit_message>
<xml_diff>
--- a/docs/Quick_Guide_EN.docx
+++ b/docs/Quick_Guide_EN.docx
@@ -468,7 +468,7 @@
         <w:rPr>
           <w:lang w:val="en"/>
         </w:rPr>
-        <w:t xml:space="preserve"> I INL 2 I" </w:t>
+        <w:t xml:space="preserve"> I INL2 I" </w:t>
       </w:r>
       <w:r>
         <w:rPr>
@@ -492,7 +492,7 @@
         <w:rPr>
           <w:lang w:val="en"/>
         </w:rPr>
-        <w:t xml:space="preserve"> I   INL 2 I </w:t>
+        <w:t xml:space="preserve"> I   INL2 I </w:t>
       </w:r>
       <w:r>
         <w:rPr>

</xml_diff>